<commit_message>
docs: update technical manual with SEC-02 and SEC-03 mitigations
</commit_message>
<xml_diff>
--- a/manual_tecnico.docx
+++ b/manual_tecnico.docx
@@ -255,12 +255,13 @@
         <w:jc w:val="left"/>
       </w:pPr>
       <w:r>
-        <w:rPr>
-          <w:rFonts w:ascii="Arial" w:hAnsi="Arial"/>
-          <w:color w:val="1F2937"/>
-          <w:sz w:val="21"/>
-        </w:rPr>
         <w:t>Las políticas RLS en Supabase garantizan que ningún usuario malintencionado pueda manipular las evaluaciones o trabajadores directamente desde el navegador a menos que posea los privilegios adecuados. Si bien el cliente interactúa con la BD usando la clave anónima pública, las operaciones de modificación de datos en tablas como 'clase', 'item_evaluacion', 'trabajador' y 'evaluacion' están restringidas por políticas del servidor PostgreSQL, requiriendo que la sesión de usuario sea válida y validando roles (como 'admin') para operaciones críticas de escritura (INSERT/UPDATE/DELETE).</w:t>
+        <w:br/>
+        <w:br/>
+        <w:t>Mitigación SEC-02 (Falsificación de Sesión): Se implementó una verificación de sesión basada en la base de datos. Al iniciar sesión, el servidor genera un token de sesión criptográfico (session_token). Cada vez que la página carga o verifica la sesión, el frontend consulta a Supabase mediante la función RPC 'verify_worker_session' para validar dicho token, impidiendo que se falsifiquen roles o identidades mediante la edición manual de 'localStorage' en el navegador.</w:t>
+        <w:br/>
+        <w:br/>
+        <w:t>Mitigación SEC-03 (Almacenamiento de Contraseñas en Texto Plano): Las contraseñas han sido protegidas utilizando un algoritmo de hashing robusto (bcrypt con Blowfish). Para lograr esto, se activó la extensión 'pgcrypto' de PostgreSQL y se creó un trigger 'trigger_hash_worker_password' que intercepta automáticamente cualquier inserción o actualización de contraseña y la cifra. Las funciones RPC de validación y cambio de contraseña comparan los valores usando la función 'crypt()', de modo que las contraseñas nunca se almacenan ni procesan en texto plano.</w:t>
       </w:r>
     </w:p>
     <w:p>
@@ -5002,21 +5003,7 @@
         <w:spacing w:after="80" w:line="276" w:lineRule="auto"/>
       </w:pPr>
       <w:r>
-        <w:rPr>
-          <w:rFonts w:ascii="Arial" w:hAnsi="Arial"/>
-          <w:b/>
-          <w:color w:val="1F2937"/>
-          <w:sz w:val="21"/>
-        </w:rPr>
-        <w:t xml:space="preserve">checkSession(): </w:t>
-      </w:r>
-      <w:r>
-        <w:rPr>
-          <w:rFonts w:ascii="Arial" w:hAnsi="Arial"/>
-          <w:color w:val="1F2937"/>
-          <w:sz w:val="21"/>
-        </w:rPr>
-        <w:t>Verifica en localStorage o sessionStorage la existencia de una sesión de usuario válida.</w:t>
+        <w:t>checkSession(): Recupera el token de sesión de localStorage o sessionStorage y realiza una validación asíncrona en el servidor de base de datos a través de 'verify_worker_session' para prevenir falsificaciones (SEC-02). Si es válido, carga el usuario, de lo contrario limpia la sesión local.</w:t>
       </w:r>
     </w:p>
     <w:p>
@@ -5071,21 +5058,7 @@
         <w:spacing w:after="80" w:line="276" w:lineRule="auto"/>
       </w:pPr>
       <w:r>
-        <w:rPr>
-          <w:rFonts w:ascii="Arial" w:hAnsi="Arial"/>
-          <w:b/>
-          <w:color w:val="1F2937"/>
-          <w:sz w:val="21"/>
-        </w:rPr>
-        <w:t xml:space="preserve">handleLogout(): </w:t>
-      </w:r>
-      <w:r>
-        <w:rPr>
-          <w:rFonts w:ascii="Arial" w:hAnsi="Arial"/>
-          <w:color w:val="1F2937"/>
-          <w:sz w:val="21"/>
-        </w:rPr>
-        <w:t>Limpia la caché de sesión y redirige al formulario de inicio de sesión.</w:t>
+        <w:t>handleLogout(): Invalida la sesión actual en el servidor eliminando el token de sesión (RPC 'revoke_worker_session'), limpia la caché y variables de sesión locales, y redirige a la pantalla de login.</w:t>
       </w:r>
     </w:p>
     <w:p>

</xml_diff>